<commit_message>
temporary map added, Waiting for permanent frontend
</commit_message>
<xml_diff>
--- a/план проекта кликер.docx
+++ b/план проекта кликер.docx
@@ -1,6 +1,6 @@
 
 <file path=word/document.xml><?xml version="1.0" encoding="utf-8"?>
-<w:document xmlns:wpc="http://schemas.microsoft.com/office/word/2010/wordprocessingCanvas" xmlns:cx="http://schemas.microsoft.com/office/drawing/2014/chartex" xmlns:cx1="http://schemas.microsoft.com/office/drawing/2015/9/8/chartex" xmlns:cx2="http://schemas.microsoft.com/office/drawing/2015/10/21/chartex" xmlns:cx3="http://schemas.microsoft.com/office/drawing/2016/5/9/chartex" xmlns:cx4="http://schemas.microsoft.com/office/drawing/2016/5/10/chartex" xmlns:cx5="http://schemas.microsoft.com/office/drawing/2016/5/11/chartex" xmlns:cx6="http://schemas.microsoft.com/office/drawing/2016/5/12/chartex" xmlns:cx7="http://schemas.microsoft.com/office/drawing/2016/5/13/chartex" xmlns:cx8="http://schemas.microsoft.com/office/drawing/2016/5/14/chartex" xmlns:mc="http://schemas.openxmlformats.org/markup-compatibility/2006" xmlns:aink="http://schemas.microsoft.com/office/drawing/2016/ink" xmlns:am3d="http://schemas.microsoft.com/office/drawing/2017/model3d" xmlns:o="urn:schemas-microsoft-com:office:office" xmlns:oel="http://schemas.microsoft.com/office/2019/extlst" xmlns:r="http://schemas.openxmlformats.org/officeDocument/2006/relationships" xmlns:m="http://schemas.openxmlformats.org/officeDocument/2006/math" xmlns:v="urn:schemas-microsoft-com:vml" xmlns:wp14="http://schemas.microsoft.com/office/word/2010/wordprocessingDrawing" xmlns:wp="http://schemas.openxmlformats.org/drawingml/2006/wordprocessingDrawing" xmlns:w10="urn:schemas-microsoft-com:office:word" xmlns:w="http://schemas.openxmlformats.org/wordprocessingml/2006/main" xmlns:w14="http://schemas.microsoft.com/office/word/2010/wordml" xmlns:w15="http://schemas.microsoft.com/office/word/2012/wordml" xmlns:w16cex="http://schemas.microsoft.com/office/word/2018/wordml/cex" xmlns:w16cid="http://schemas.microsoft.com/office/word/2016/wordml/cid" xmlns:w16="http://schemas.microsoft.com/office/word/2018/wordml" xmlns:w16du="http://schemas.microsoft.com/office/word/2023/wordml/word16du" xmlns:w16sdtdh="http://schemas.microsoft.com/office/word/2020/wordml/sdtdatahash" xmlns:w16sdtfl="http://schemas.microsoft.com/office/word/2024/wordml/sdtformatlock" xmlns:w16se="http://schemas.microsoft.com/office/word/2015/wordml/symex" xmlns:wpg="http://schemas.microsoft.com/office/word/2010/wordprocessingGroup" xmlns:wpi="http://schemas.microsoft.com/office/word/2010/wordprocessingInk" xmlns:wne="http://schemas.microsoft.com/office/word/2006/wordml" xmlns:wps="http://schemas.microsoft.com/office/word/2010/wordprocessingShape" mc:Ignorable="w14 w15 w16se w16cid w16 w16cex w16sdtdh w16sdtfl w16du wp14">
+<w:document xmlns:wpc="http://schemas.microsoft.com/office/word/2010/wordprocessingCanvas" xmlns:cx="http://schemas.microsoft.com/office/drawing/2014/chartex" xmlns:cx1="http://schemas.microsoft.com/office/drawing/2015/9/8/chartex" xmlns:cx2="http://schemas.microsoft.com/office/drawing/2015/10/21/chartex" xmlns:cx3="http://schemas.microsoft.com/office/drawing/2016/5/9/chartex" xmlns:cx4="http://schemas.microsoft.com/office/drawing/2016/5/10/chartex" xmlns:cx5="http://schemas.microsoft.com/office/drawing/2016/5/11/chartex" xmlns:cx6="http://schemas.microsoft.com/office/drawing/2016/5/12/chartex" xmlns:cx7="http://schemas.microsoft.com/office/drawing/2016/5/13/chartex" xmlns:cx8="http://schemas.microsoft.com/office/drawing/2016/5/14/chartex" xmlns:mc="http://schemas.openxmlformats.org/markup-compatibility/2006" xmlns:aink="http://schemas.microsoft.com/office/drawing/2016/ink" xmlns:am3d="http://schemas.microsoft.com/office/drawing/2017/model3d" xmlns:o="urn:schemas-microsoft-com:office:office" xmlns:r="http://schemas.openxmlformats.org/officeDocument/2006/relationships" xmlns:m="http://schemas.openxmlformats.org/officeDocument/2006/math" xmlns:v="urn:schemas-microsoft-com:vml" xmlns:wp14="http://schemas.microsoft.com/office/word/2010/wordprocessingDrawing" xmlns:wp="http://schemas.openxmlformats.org/drawingml/2006/wordprocessingDrawing" xmlns:w10="urn:schemas-microsoft-com:office:word" xmlns:w="http://schemas.openxmlformats.org/wordprocessingml/2006/main" xmlns:w14="http://schemas.microsoft.com/office/word/2010/wordml" xmlns:w15="http://schemas.microsoft.com/office/word/2012/wordml" xmlns:w16cex="http://schemas.microsoft.com/office/word/2018/wordml/cex" xmlns:w16cid="http://schemas.microsoft.com/office/word/2016/wordml/cid" xmlns:w16="http://schemas.microsoft.com/office/word/2018/wordml" xmlns:w16se="http://schemas.microsoft.com/office/word/2015/wordml/symex" xmlns:wpg="http://schemas.microsoft.com/office/word/2010/wordprocessingGroup" xmlns:wpi="http://schemas.microsoft.com/office/word/2010/wordprocessingInk" xmlns:wne="http://schemas.microsoft.com/office/word/2006/wordml" xmlns:wps="http://schemas.microsoft.com/office/word/2010/wordprocessingShape" mc:Ignorable="w14 w15 w16se w16cid w16 w16cex wp14">
   <w:body>
     <w:p>
       <w:pPr>
@@ -69,10 +69,15 @@
         <w:t xml:space="preserve">1. Переименовать файлы, разбор кода, создать свои </w:t>
       </w:r>
       <w:proofErr w:type="spellStart"/>
+      <w:proofErr w:type="gramStart"/>
       <w:r>
         <w:t>коментарии</w:t>
       </w:r>
       <w:proofErr w:type="spellEnd"/>
+      <w:r>
+        <w:t xml:space="preserve"> !</w:t>
+      </w:r>
+      <w:proofErr w:type="gramEnd"/>
     </w:p>
     <w:p>
       <w:r>
@@ -109,40 +114,88 @@
       </w:r>
       <w:proofErr w:type="spellEnd"/>
       <w:r>
-        <w:t xml:space="preserve"> событий</w:t>
-      </w:r>
+        <w:t xml:space="preserve"> </w:t>
+      </w:r>
+      <w:proofErr w:type="gramStart"/>
+      <w:r>
+        <w:t>событий</w:t>
+      </w:r>
+      <w:r>
+        <w:t xml:space="preserve"> !</w:t>
+      </w:r>
+      <w:proofErr w:type="gramEnd"/>
     </w:p>
     <w:p>
       <w:r>
         <w:t xml:space="preserve">4. </w:t>
       </w:r>
       <w:r>
-        <w:t>добавить админ панель / чит панель</w:t>
-      </w:r>
-    </w:p>
-    <w:p>
+        <w:t xml:space="preserve">добавить админ панель / чит </w:t>
+      </w:r>
+      <w:proofErr w:type="gramStart"/>
+      <w:r>
+        <w:t>панель</w:t>
+      </w:r>
+      <w:r>
+        <w:t xml:space="preserve"> !</w:t>
+      </w:r>
+      <w:proofErr w:type="gramEnd"/>
+    </w:p>
+    <w:p>
+      <w:pPr>
+        <w:rPr>
+          <w:lang w:val="en-US"/>
+        </w:rPr>
+      </w:pPr>
       <w:r>
         <w:t xml:space="preserve">5. добавить </w:t>
       </w:r>
       <w:r>
-        <w:t xml:space="preserve">звуки интерфейса </w:t>
-      </w:r>
+        <w:t xml:space="preserve">звуки </w:t>
+      </w:r>
+      <w:proofErr w:type="gramStart"/>
+      <w:r>
+        <w:t xml:space="preserve">интерфейса </w:t>
+      </w:r>
+      <w:r>
+        <w:rPr>
+          <w:lang w:val="en-US"/>
+        </w:rPr>
+        <w:t>?</w:t>
+      </w:r>
+      <w:proofErr w:type="gramEnd"/>
     </w:p>
     <w:p>
       <w:r>
         <w:t>5,1.  добавить фоновую музыку</w:t>
       </w:r>
       <w:r>
-        <w:t xml:space="preserve"> локаций</w:t>
-      </w:r>
+        <w:t xml:space="preserve"> </w:t>
+      </w:r>
+      <w:proofErr w:type="gramStart"/>
+      <w:r>
+        <w:t>локаций</w:t>
+      </w:r>
+      <w:r>
+        <w:t xml:space="preserve"> ?</w:t>
+      </w:r>
+      <w:proofErr w:type="gramEnd"/>
     </w:p>
     <w:p>
       <w:r>
         <w:t xml:space="preserve">6. </w:t>
       </w:r>
       <w:r>
-        <w:t>взаимодействие с предметами на локациях</w:t>
-      </w:r>
+        <w:t xml:space="preserve">взаимодействие с предметами на </w:t>
+      </w:r>
+      <w:proofErr w:type="gramStart"/>
+      <w:r>
+        <w:t>локациях</w:t>
+      </w:r>
+      <w:r>
+        <w:t xml:space="preserve"> ?</w:t>
+      </w:r>
+      <w:proofErr w:type="gramEnd"/>
     </w:p>
     <w:p>
       <w:r>
@@ -152,18 +205,42 @@
         <w:t xml:space="preserve">| </w:t>
       </w:r>
       <w:r>
-        <w:t>доступность локаций по времени</w:t>
-      </w:r>
-    </w:p>
-    <w:p>
-      <w:r>
-        <w:t xml:space="preserve">8. оформление группы (платно) </w:t>
-      </w:r>
-    </w:p>
-    <w:p>
-      <w:r>
-        <w:t>9. организация концертов (успех концерта зависит от опыта группы)</w:t>
-      </w:r>
+        <w:t xml:space="preserve">доступность локаций по </w:t>
+      </w:r>
+      <w:proofErr w:type="gramStart"/>
+      <w:r>
+        <w:t>времени</w:t>
+      </w:r>
+      <w:r>
+        <w:t xml:space="preserve"> ?</w:t>
+      </w:r>
+      <w:proofErr w:type="gramEnd"/>
+    </w:p>
+    <w:p>
+      <w:r>
+        <w:t>8. оформление группы (платно</w:t>
+      </w:r>
+      <w:proofErr w:type="gramStart"/>
+      <w:r>
+        <w:t xml:space="preserve">) </w:t>
+      </w:r>
+      <w:r>
+        <w:t>?</w:t>
+      </w:r>
+      <w:proofErr w:type="gramEnd"/>
+    </w:p>
+    <w:p>
+      <w:r>
+        <w:t>9. организация концертов (успех концерта зависит от опыта группы</w:t>
+      </w:r>
+      <w:proofErr w:type="gramStart"/>
+      <w:r>
+        <w:t>)</w:t>
+      </w:r>
+      <w:r>
+        <w:t xml:space="preserve"> ?</w:t>
+      </w:r>
+      <w:proofErr w:type="gramEnd"/>
     </w:p>
     <w:p>
       <w:r>
@@ -195,23 +272,46 @@
       </w:r>
       <w:proofErr w:type="spellEnd"/>
       <w:r>
-        <w:t xml:space="preserve"> имён, возраста, опыта игры, картинку. Зависимость опыта от славы игрока</w:t>
-      </w:r>
+        <w:t xml:space="preserve"> имён, возраста, опыта игры, картинку. Зависимость опыта от славы </w:t>
+      </w:r>
+      <w:proofErr w:type="gramStart"/>
+      <w:r>
+        <w:t>игрока</w:t>
+      </w:r>
+      <w:r>
+        <w:t xml:space="preserve"> ?</w:t>
+      </w:r>
+      <w:proofErr w:type="gramEnd"/>
     </w:p>
     <w:p>
       <w:r>
         <w:t>11</w:t>
       </w:r>
       <w:r>
-        <w:t>. репетиции (добавить несколько локаций для аренды), эффективность локации зависит от цены</w:t>
-      </w:r>
-    </w:p>
-    <w:p>
-      <w:r>
-        <w:t>10.</w:t>
-      </w:r>
-    </w:p>
-    <w:p/>
+        <w:t xml:space="preserve">. репетиции (добавить несколько локаций для аренды), эффективность локации зависит от </w:t>
+      </w:r>
+      <w:proofErr w:type="gramStart"/>
+      <w:r>
+        <w:t>цены</w:t>
+      </w:r>
+      <w:r>
+        <w:t xml:space="preserve"> ?</w:t>
+      </w:r>
+      <w:proofErr w:type="gramEnd"/>
+    </w:p>
+    <w:p>
+      <w:r>
+        <w:rPr>
+          <w:lang w:val="en-US"/>
+        </w:rPr>
+        <w:t xml:space="preserve">12. </w:t>
+      </w:r>
+      <w:r>
+        <w:t>Добавить больше событий</w:t>
+      </w:r>
+      <w:bookmarkStart w:id="0" w:name="_GoBack"/>
+      <w:bookmarkEnd w:id="0"/>
+    </w:p>
     <w:p/>
     <w:p>
       <w:r>
@@ -222,11 +322,6 @@
       </w:r>
     </w:p>
     <w:p>
-      <w:pPr>
-        <w:rPr>
-          <w:lang w:val="en-US"/>
-        </w:rPr>
-      </w:pPr>
       <w:r>
         <w:t>1.</w:t>
       </w:r>
@@ -236,9 +331,6 @@
     </w:p>
     <w:p>
       <w:r>
-        <w:rPr>
-          <w:lang w:val="en-US"/>
-        </w:rPr>
         <w:t>2.</w:t>
       </w:r>
       <w:r>
@@ -298,7 +390,6 @@
     </w:p>
     <w:p>
       <w:r>
-        <w:lastRenderedPageBreak/>
         <w:t>*Добавить аватарки</w:t>
       </w:r>
     </w:p>
@@ -505,7 +596,7 @@
 </file>
 
 <file path=word/numbering.xml><?xml version="1.0" encoding="utf-8"?>
-<w:numbering xmlns:wpc="http://schemas.microsoft.com/office/word/2010/wordprocessingCanvas" xmlns:cx="http://schemas.microsoft.com/office/drawing/2014/chartex" xmlns:cx1="http://schemas.microsoft.com/office/drawing/2015/9/8/chartex" xmlns:cx2="http://schemas.microsoft.com/office/drawing/2015/10/21/chartex" xmlns:cx3="http://schemas.microsoft.com/office/drawing/2016/5/9/chartex" xmlns:cx4="http://schemas.microsoft.com/office/drawing/2016/5/10/chartex" xmlns:cx5="http://schemas.microsoft.com/office/drawing/2016/5/11/chartex" xmlns:cx6="http://schemas.microsoft.com/office/drawing/2016/5/12/chartex" xmlns:cx7="http://schemas.microsoft.com/office/drawing/2016/5/13/chartex" xmlns:cx8="http://schemas.microsoft.com/office/drawing/2016/5/14/chartex" xmlns:mc="http://schemas.openxmlformats.org/markup-compatibility/2006" xmlns:aink="http://schemas.microsoft.com/office/drawing/2016/ink" xmlns:am3d="http://schemas.microsoft.com/office/drawing/2017/model3d" xmlns:o="urn:schemas-microsoft-com:office:office" xmlns:oel="http://schemas.microsoft.com/office/2019/extlst" xmlns:r="http://schemas.openxmlformats.org/officeDocument/2006/relationships" xmlns:m="http://schemas.openxmlformats.org/officeDocument/2006/math" xmlns:v="urn:schemas-microsoft-com:vml" xmlns:wp14="http://schemas.microsoft.com/office/word/2010/wordprocessingDrawing" xmlns:wp="http://schemas.openxmlformats.org/drawingml/2006/wordprocessingDrawing" xmlns:w10="urn:schemas-microsoft-com:office:word" xmlns:w="http://schemas.openxmlformats.org/wordprocessingml/2006/main" xmlns:w14="http://schemas.microsoft.com/office/word/2010/wordml" xmlns:w15="http://schemas.microsoft.com/office/word/2012/wordml" xmlns:w16cex="http://schemas.microsoft.com/office/word/2018/wordml/cex" xmlns:w16cid="http://schemas.microsoft.com/office/word/2016/wordml/cid" xmlns:w16="http://schemas.microsoft.com/office/word/2018/wordml" xmlns:w16du="http://schemas.microsoft.com/office/word/2023/wordml/word16du" xmlns:w16sdtdh="http://schemas.microsoft.com/office/word/2020/wordml/sdtdatahash" xmlns:w16sdtfl="http://schemas.microsoft.com/office/word/2024/wordml/sdtformatlock" xmlns:w16se="http://schemas.microsoft.com/office/word/2015/wordml/symex" xmlns:wpg="http://schemas.microsoft.com/office/word/2010/wordprocessingGroup" xmlns:wpi="http://schemas.microsoft.com/office/word/2010/wordprocessingInk" xmlns:wne="http://schemas.microsoft.com/office/word/2006/wordml" xmlns:wps="http://schemas.microsoft.com/office/word/2010/wordprocessingShape" mc:Ignorable="w14 w15 w16se w16cid w16 w16cex w16sdtdh w16sdtfl w16du wp14">
+<w:numbering xmlns:wpc="http://schemas.microsoft.com/office/word/2010/wordprocessingCanvas" xmlns:cx="http://schemas.microsoft.com/office/drawing/2014/chartex" xmlns:cx1="http://schemas.microsoft.com/office/drawing/2015/9/8/chartex" xmlns:cx2="http://schemas.microsoft.com/office/drawing/2015/10/21/chartex" xmlns:cx3="http://schemas.microsoft.com/office/drawing/2016/5/9/chartex" xmlns:cx4="http://schemas.microsoft.com/office/drawing/2016/5/10/chartex" xmlns:cx5="http://schemas.microsoft.com/office/drawing/2016/5/11/chartex" xmlns:cx6="http://schemas.microsoft.com/office/drawing/2016/5/12/chartex" xmlns:cx7="http://schemas.microsoft.com/office/drawing/2016/5/13/chartex" xmlns:cx8="http://schemas.microsoft.com/office/drawing/2016/5/14/chartex" xmlns:mc="http://schemas.openxmlformats.org/markup-compatibility/2006" xmlns:aink="http://schemas.microsoft.com/office/drawing/2016/ink" xmlns:am3d="http://schemas.microsoft.com/office/drawing/2017/model3d" xmlns:o="urn:schemas-microsoft-com:office:office" xmlns:r="http://schemas.openxmlformats.org/officeDocument/2006/relationships" xmlns:m="http://schemas.openxmlformats.org/officeDocument/2006/math" xmlns:v="urn:schemas-microsoft-com:vml" xmlns:wp14="http://schemas.microsoft.com/office/word/2010/wordprocessingDrawing" xmlns:wp="http://schemas.openxmlformats.org/drawingml/2006/wordprocessingDrawing" xmlns:w10="urn:schemas-microsoft-com:office:word" xmlns:w="http://schemas.openxmlformats.org/wordprocessingml/2006/main" xmlns:w14="http://schemas.microsoft.com/office/word/2010/wordml" xmlns:w15="http://schemas.microsoft.com/office/word/2012/wordml" xmlns:w16cex="http://schemas.microsoft.com/office/word/2018/wordml/cex" xmlns:w16cid="http://schemas.microsoft.com/office/word/2016/wordml/cid" xmlns:w16="http://schemas.microsoft.com/office/word/2018/wordml" xmlns:w16se="http://schemas.microsoft.com/office/word/2015/wordml/symex" xmlns:wpg="http://schemas.microsoft.com/office/word/2010/wordprocessingGroup" xmlns:wpi="http://schemas.microsoft.com/office/word/2010/wordprocessingInk" xmlns:wne="http://schemas.microsoft.com/office/word/2006/wordml" xmlns:wps="http://schemas.microsoft.com/office/word/2010/wordprocessingShape" mc:Ignorable="w14 w15 w16se w16cid w16 w16cex wp14">
   <w:abstractNum w:abstractNumId="0" w15:restartNumberingAfterBreak="0">
     <w:nsid w:val="0841586A"/>
     <w:multiLevelType w:val="hybridMultilevel"/>
@@ -845,20 +936,20 @@
       </w:rPr>
     </w:lvl>
   </w:abstractNum>
-  <w:num w:numId="1" w16cid:durableId="1903904050">
+  <w:num w:numId="1">
     <w:abstractNumId w:val="2"/>
   </w:num>
-  <w:num w:numId="2" w16cid:durableId="987900664">
+  <w:num w:numId="2">
     <w:abstractNumId w:val="1"/>
   </w:num>
-  <w:num w:numId="3" w16cid:durableId="1292398245">
+  <w:num w:numId="3">
     <w:abstractNumId w:val="0"/>
   </w:num>
 </w:numbering>
 </file>
 
 <file path=word/styles.xml><?xml version="1.0" encoding="utf-8"?>
-<w:styles xmlns:mc="http://schemas.openxmlformats.org/markup-compatibility/2006" xmlns:r="http://schemas.openxmlformats.org/officeDocument/2006/relationships" xmlns:w="http://schemas.openxmlformats.org/wordprocessingml/2006/main" xmlns:w14="http://schemas.microsoft.com/office/word/2010/wordml" xmlns:w15="http://schemas.microsoft.com/office/word/2012/wordml" xmlns:w16cex="http://schemas.microsoft.com/office/word/2018/wordml/cex" xmlns:w16cid="http://schemas.microsoft.com/office/word/2016/wordml/cid" xmlns:w16="http://schemas.microsoft.com/office/word/2018/wordml" xmlns:w16du="http://schemas.microsoft.com/office/word/2023/wordml/word16du" xmlns:w16sdtdh="http://schemas.microsoft.com/office/word/2020/wordml/sdtdatahash" xmlns:w16sdtfl="http://schemas.microsoft.com/office/word/2024/wordml/sdtformatlock" xmlns:w16se="http://schemas.microsoft.com/office/word/2015/wordml/symex" mc:Ignorable="w14 w15 w16se w16cid w16 w16cex w16sdtdh w16sdtfl w16du">
+<w:styles xmlns:mc="http://schemas.openxmlformats.org/markup-compatibility/2006" xmlns:r="http://schemas.openxmlformats.org/officeDocument/2006/relationships" xmlns:w="http://schemas.openxmlformats.org/wordprocessingml/2006/main" xmlns:w14="http://schemas.microsoft.com/office/word/2010/wordml" xmlns:w15="http://schemas.microsoft.com/office/word/2012/wordml" xmlns:w16cex="http://schemas.microsoft.com/office/word/2018/wordml/cex" xmlns:w16cid="http://schemas.microsoft.com/office/word/2016/wordml/cid" xmlns:w16="http://schemas.microsoft.com/office/word/2018/wordml" xmlns:w16se="http://schemas.microsoft.com/office/word/2015/wordml/symex" mc:Ignorable="w14 w15 w16se w16cid w16 w16cex">
   <w:docDefaults>
     <w:rPrDefault>
       <w:rPr>

</xml_diff>